<commit_message>
docs: update name to Navya Akurathi, experience to 10+, location to United States
</commit_message>
<xml_diff>
--- a/Healthcare_Platform_Technical_Reference.docx
+++ b/Healthcare_Platform_Technical_Reference.docx
@@ -68,7 +68,7 @@
           <w:sz w:val="32"/>
           <w:szCs w:val="32"/>
         </w:rPr>
-        <w:t xml:space="preserve">Navya Kumar</w:t>
+        <w:t xml:space="preserve">Navya Akurathi</w:t>
       </w:r>
     </w:p>
     <w:p>
@@ -83,7 +83,7 @@
           <w:sz w:val="24"/>
           <w:szCs w:val="24"/>
         </w:rPr>
-        <w:t xml:space="preserve">Senior Java Full Stack Developer  |  9 Years Experience</w:t>
+        <w:t xml:space="preserve">Senior Java Full Stack Developer  |  10+ Years Experience</w:t>
       </w:r>
     </w:p>
     <w:p>
@@ -98,7 +98,7 @@
           <w:sz w:val="22"/>
           <w:szCs w:val="22"/>
         </w:rPr>
-        <w:t xml:space="preserve">Canton / Ann Arbor, Michigan</w:t>
+        <w:t xml:space="preserve">United States</w:t>
       </w:r>
     </w:p>
     <w:p>

</xml_diff>